<commit_message>
Functionele specificatie bijgewerkt met besluiten over de open punten
Co-Authored-By: Claude Opus 5.5 <noreply@anthropic.com>
Claude-Session: https://claude.ai/code/session_01Dh1Q6wUYPFUvMXhayyvM4T
</commit_message>
<xml_diff>
--- a/docs/Functionele_specificatie_Kabelcontrole_20kV.docx
+++ b/docs/Functionele_specificatie_Kabelcontrole_20kV.docx
@@ -147,7 +147,7 @@
         </w:numPr>
       </w:pPr>
       <w:r>
-        <w:t xml:space="preserve">Eén gebruiker per toestel; gegevens staan lokaal op het toestel.</w:t>
+        <w:t xml:space="preserve">Eén gebruiker per toestel; gegevens staan lokaal op het toestel en worden opgeslagen in de OneDrive-map van het Teams-kanaal van het project (FR-30).</w:t>
       </w:r>
     </w:p>
     <w:p>
@@ -167,7 +167,7 @@
     <w:p>
       <w:pPr/>
       <w:r>
-        <w:t xml:space="preserve">De app kent in versie 1 geen inlog of rechten; de rol volgt uit wie het toestel gebruikt. Elke registratie en vrijgave wordt vastgelegd op de naam die de gebruiker in de instellingen heeft ingevuld.</w:t>
+        <w:t xml:space="preserve">De app kent in versie 1 geen inlog; de gebruiker kiest bij Instellingen zijn of haar naam en rol. Elke registratie, vrijgave en intrekking wordt vastgelegd op naam en rol. Alleen de rol Werkverantwoordelijke kan een tracédeel vrijgeven voor aanvullen of een vrijgave intrekken (OP-04).</w:t>
       </w:r>
     </w:p>
     <w:tbl>
@@ -179,8 +179,8 @@
       </w:tblPr>
       <w:tblGrid>
         <w:gridCol w:w="2340"/>
-        <w:gridCol w:w="1820"/>
-        <w:gridCol w:w="3262"/>
+        <w:gridCol w:w="2340"/>
+        <w:gridCol w:w="2742"/>
         <w:gridCol w:w="1938"/>
       </w:tblGrid>
       <w:tr>
@@ -201,7 +201,7 @@
         </w:tc>
         <w:tc>
           <w:tcPr>
-            <w:tcW w:w="1820" w:type="dxa"/>
+            <w:tcW w:w="2340" w:type="dxa"/>
             <w:shd w:val="clear" w:color="auto" w:fill="F2F2F2"/>
           </w:tcPr>
           <w:p>
@@ -213,7 +213,7 @@
         </w:tc>
         <w:tc>
           <w:tcPr>
-            <w:tcW w:w="3262" w:type="dxa"/>
+            <w:tcW w:w="2742" w:type="dxa"/>
             <w:shd w:val="clear" w:color="auto" w:fill="F2F2F2"/>
           </w:tcPr>
           <w:p>
@@ -250,7 +250,7 @@
         </w:tc>
         <w:tc>
           <w:tcPr>
-            <w:tcW w:w="1820" w:type="dxa"/>
+            <w:tcW w:w="2340" w:type="dxa"/>
           </w:tcPr>
           <w:p>
             <w:pPr/>
@@ -261,12 +261,12 @@
         </w:tc>
         <w:tc>
           <w:tcPr>
-            <w:tcW w:w="3262" w:type="dxa"/>
-          </w:tcPr>
-          <w:p>
-            <w:pPr/>
-            <w:r>
-              <w:t xml:space="preserve">Registreert dekking, zandomhulling, markering, kruisingen en parallelligging</w:t>
+            <w:tcW w:w="2742" w:type="dxa"/>
+          </w:tcPr>
+          <w:p>
+            <w:pPr/>
+            <w:r>
+              <w:t xml:space="preserve">Registreert dekking, zandomhulling, markering, kruisingen, parallelligging, mantelbuizen, inmeting en verdichting</w:t>
             </w:r>
           </w:p>
         </w:tc>
@@ -296,7 +296,7 @@
         </w:tc>
         <w:tc>
           <w:tcPr>
-            <w:tcW w:w="1820" w:type="dxa"/>
+            <w:tcW w:w="2340" w:type="dxa"/>
           </w:tcPr>
           <w:p>
             <w:pPr/>
@@ -307,12 +307,12 @@
         </w:tc>
         <w:tc>
           <w:tcPr>
-            <w:tcW w:w="3262" w:type="dxa"/>
-          </w:tcPr>
-          <w:p>
-            <w:pPr/>
-            <w:r>
-              <w:t xml:space="preserve">Registreert trekkracht, buigstraal, legtemperatuur en moffen</w:t>
+            <w:tcW w:w="2742" w:type="dxa"/>
+          </w:tcPr>
+          <w:p>
+            <w:pPr/>
+            <w:r>
+              <w:t xml:space="preserve">Registreert kabelgegevens, trekkracht, buigstraal, legtemperatuur, moffen, eindsluitingen en aarding</w:t>
             </w:r>
           </w:p>
         </w:tc>
@@ -323,7 +323,7 @@
           <w:p>
             <w:pPr/>
             <w:r>
-              <w:t xml:space="preserve">Bij het trekken van de kabel en in de mofput</w:t>
+              <w:t xml:space="preserve">Bij het trekken van de kabel, in de mofput en in het station</w:t>
             </w:r>
           </w:p>
         </w:tc>
@@ -336,13 +336,59 @@
           <w:p>
             <w:pPr/>
             <w:r>
-              <w:t xml:space="preserve">Toezichthouder / werkverantwoordelijke</w:t>
-            </w:r>
-          </w:p>
-        </w:tc>
-        <w:tc>
-          <w:tcPr>
-            <w:tcW w:w="1820" w:type="dxa"/>
+              <w:t xml:space="preserve">Werkverantwoordelijke</w:t>
+            </w:r>
+          </w:p>
+        </w:tc>
+        <w:tc>
+          <w:tcPr>
+            <w:tcW w:w="2340" w:type="dxa"/>
+          </w:tcPr>
+          <w:p>
+            <w:pPr/>
+            <w:r>
+              <w:t xml:space="preserve">Werkverantwoordelijke van de aannemer</w:t>
+            </w:r>
+          </w:p>
+        </w:tc>
+        <w:tc>
+          <w:tcPr>
+            <w:tcW w:w="2742" w:type="dxa"/>
+          </w:tcPr>
+          <w:p>
+            <w:pPr/>
+            <w:r>
+              <w:t xml:space="preserve">Geeft tracédelen vrij voor aanvullen en trekt vrijgaven in; registreert en exporteert zoals de anderen</w:t>
+            </w:r>
+          </w:p>
+        </w:tc>
+        <w:tc>
+          <w:tcPr>
+            <w:tcW w:w="1938" w:type="dxa"/>
+          </w:tcPr>
+          <w:p>
+            <w:pPr/>
+            <w:r>
+              <w:t xml:space="preserve">Op locatie</w:t>
+            </w:r>
+          </w:p>
+        </w:tc>
+      </w:tr>
+      <w:tr>
+        <w:tc>
+          <w:tcPr>
+            <w:tcW w:w="2340" w:type="dxa"/>
+          </w:tcPr>
+          <w:p>
+            <w:pPr/>
+            <w:r>
+              <w:t xml:space="preserve">Toezichthouder</w:t>
+            </w:r>
+          </w:p>
+        </w:tc>
+        <w:tc>
+          <w:tcPr>
+            <w:tcW w:w="2340" w:type="dxa"/>
           </w:tcPr>
           <w:p>
             <w:pPr/>
@@ -353,12 +399,12 @@
         </w:tc>
         <w:tc>
           <w:tcPr>
-            <w:tcW w:w="3262" w:type="dxa"/>
-          </w:tcPr>
-          <w:p>
-            <w:pPr/>
-            <w:r>
-              <w:t xml:space="preserve">Controleert registraties, geeft tracédelen vrij voor aanvullen, exporteert het dossier</w:t>
+            <w:tcW w:w="2742" w:type="dxa"/>
+          </w:tcPr>
+          <w:p>
+            <w:pPr/>
+            <w:r>
+              <w:t xml:space="preserve">Controleert registraties en exporteert het dossier</w:t>
             </w:r>
           </w:p>
         </w:tc>
@@ -388,7 +434,7 @@
         </w:tc>
         <w:tc>
           <w:tcPr>
-            <w:tcW w:w="1820" w:type="dxa"/>
+            <w:tcW w:w="2340" w:type="dxa"/>
           </w:tcPr>
           <w:p>
             <w:pPr/>
@@ -399,7 +445,7 @@
         </w:tc>
         <w:tc>
           <w:tcPr>
-            <w:tcW w:w="3262" w:type="dxa"/>
+            <w:tcW w:w="2742" w:type="dxa"/>
           </w:tcPr>
           <w:p>
             <w:pPr/>
@@ -434,7 +480,7 @@
         </w:tc>
         <w:tc>
           <w:tcPr>
-            <w:tcW w:w="1820" w:type="dxa"/>
+            <w:tcW w:w="2340" w:type="dxa"/>
           </w:tcPr>
           <w:p>
             <w:pPr/>
@@ -445,12 +491,12 @@
         </w:tc>
         <w:tc>
           <w:tcPr>
-            <w:tcW w:w="3262" w:type="dxa"/>
-          </w:tcPr>
-          <w:p>
-            <w:pPr/>
-            <w:r>
-              <w:t xml:space="preserve">Leest het bewijsdossier (PDF/Word); gebruikt de app zelf niet</w:t>
+            <w:tcW w:w="2742" w:type="dxa"/>
+          </w:tcPr>
+          <w:p>
+            <w:pPr/>
+            <w:r>
+              <w:t xml:space="preserve">Leest het bewijsdossier (PDF/Word) en de OneDrive/Teams-map; gebruikt de app zelf niet</w:t>
             </w:r>
           </w:p>
         </w:tc>
@@ -853,7 +899,7 @@
     <w:p>
       <w:pPr/>
       <w:r>
-        <w:t xml:space="preserve">De app moet 26 functies bieden, waarvan 20 Must. Prioriteit volgens MoSCoW: Must = nodig voor versie 1, Should = gewenst in versie 1, Could = als het past.</w:t>
+        <w:t xml:space="preserve">De app moet 30 functies bieden, waarvan 25 Must. Prioriteit volgens MoSCoW: Must = nodig voor versie 1, Should = gewenst in versie 1, Could = als het past. FR-18, FR-20, FR-22, FR-26 en FR-27 t/m FR-30 zijn aangepast of toegevoegd na de besluiten over de open punten (hoofdstuk 10).</w:t>
       </w:r>
     </w:p>
     <w:tbl>
@@ -1044,7 +1090,7 @@
           <w:p>
             <w:pPr/>
             <w:r>
-              <w:t xml:space="preserve">Project verwijderen, inclusief tracédelen, registraties en foto's, na bevestiging.</w:t>
+              <w:t xml:space="preserve">Project verwijderen na bevestiging, alleen zolang het geen registraties bevat.</w:t>
             </w:r>
           </w:p>
         </w:tc>
@@ -1182,7 +1228,7 @@
           <w:p>
             <w:pPr/>
             <w:r>
-              <w:t xml:space="preserve">Per tracédeel kiezen welke eisen aangetoond moeten worden; standaardset voorgeselecteerd: gronddekking, zandomhulling, markering, buigstraal en mantelbeproeving.</w:t>
+              <w:t xml:space="preserve">Per tracédeel kiezen welke eisen aangetoond moeten worden; standaardset voorgeselecteerd: gronddekking, zandomhulling, markering, inmeting, kabel- en haspelgegevens, buigstraal en mantelbeproeving.</w:t>
             </w:r>
           </w:p>
         </w:tc>
@@ -1228,7 +1274,7 @@
           <w:p>
             <w:pPr/>
             <w:r>
-              <w:t xml:space="preserve">Tracédeel wijzigen en verwijderen.</w:t>
+              <w:t xml:space="preserve">Tracédeel wijzigen; verwijderen alleen zolang het geen registraties bevat.</w:t>
             </w:r>
           </w:p>
         </w:tc>
@@ -1504,7 +1550,7 @@
           <w:p>
             <w:pPr/>
             <w:r>
-              <w:t xml:space="preserve">Naam van de gebruiker, datum en tijd automatisch vastleggen.</w:t>
+              <w:t xml:space="preserve">Naam en rol van de gebruiker, datum en tijd automatisch vastleggen.</w:t>
             </w:r>
           </w:p>
         </w:tc>
@@ -1688,7 +1734,7 @@
           <w:p>
             <w:pPr/>
             <w:r>
-              <w:t xml:space="preserve">De laatste registratie per eis bepaalt de status; eerdere registraties blijven zichtbaar als historie.</w:t>
+              <w:t xml:space="preserve">De laatste niet-ingetrokken registratie per eis bepaalt de status; eerdere registraties blijven zichtbaar als historie met status Vervangen.</w:t>
             </w:r>
           </w:p>
         </w:tc>
@@ -1734,7 +1780,7 @@
           <w:p>
             <w:pPr/>
             <w:r>
-              <w:t xml:space="preserve">Registratie verwijderen na bevestiging (zie open punt OP-03).</w:t>
+              <w:t xml:space="preserve">Registraties worden nooit verwijderd. Een onjuiste registratie wordt ingetrokken met verplichte reden, naam en tijdstip, en blijft zichtbaar met status Ingetrokken (OP-03).</w:t>
             </w:r>
           </w:p>
         </w:tc>
@@ -1745,7 +1791,7 @@
           <w:p>
             <w:pPr/>
             <w:r>
-              <w:t xml:space="preserve">Could</w:t>
+              <w:t xml:space="preserve">Must</w:t>
             </w:r>
           </w:p>
         </w:tc>
@@ -1826,7 +1872,7 @@
           <w:p>
             <w:pPr/>
             <w:r>
-              <w:t xml:space="preserve">Vrijgave voor aanvullen alleen mogelijk als alle eisen vóór aanvullen voldoen; vastgelegd op naam en tijdstip na bevestiging.</w:t>
+              <w:t xml:space="preserve">Vrijgave voor aanvullen alleen door de werkverantwoordelijke en alleen als alle eisen vóór aanvullen voldoen; vastgelegd op naam, rol en tijdstip na bevestiging (OP-04).</w:t>
             </w:r>
           </w:p>
         </w:tc>
@@ -1918,7 +1964,7 @@
           <w:p>
             <w:pPr/>
             <w:r>
-              <w:t xml:space="preserve">Vrijgave intrekken.</w:t>
+              <w:t xml:space="preserve">Vrijgave intrekken door de werkverantwoordelijke, met verplichte reden; elke vrijgave en intrekking blijft in de vrijgavehistorie.</w:t>
             </w:r>
           </w:p>
         </w:tc>
@@ -2102,7 +2148,7 @@
           <w:p>
             <w:pPr/>
             <w:r>
-              <w:t xml:space="preserve">Naam en bedrijf instellen; melding op het startscherm zolang de naam ontbreekt.</w:t>
+              <w:t xml:space="preserve">Naam, bedrijf en rol instellen; melding op het startscherm zolang naam of rol ontbreekt.</w:t>
             </w:r>
           </w:p>
         </w:tc>
@@ -2118,6 +2164,190 @@
           </w:p>
         </w:tc>
       </w:tr>
+      <w:tr>
+        <w:tc>
+          <w:tcPr>
+            <w:tcW w:w="962" w:type="dxa"/>
+          </w:tcPr>
+          <w:p>
+            <w:pPr/>
+            <w:r>
+              <w:t xml:space="preserve">FR-27</w:t>
+            </w:r>
+          </w:p>
+        </w:tc>
+        <w:tc>
+          <w:tcPr>
+            <w:tcW w:w="1623" w:type="dxa"/>
+          </w:tcPr>
+          <w:p>
+            <w:pPr/>
+            <w:r>
+              <w:t xml:space="preserve">Project</w:t>
+            </w:r>
+          </w:p>
+        </w:tc>
+        <w:tc>
+          <w:tcPr>
+            <w:tcW w:w="5457" w:type="dxa"/>
+          </w:tcPr>
+          <w:p>
+            <w:pPr/>
+            <w:r>
+              <w:t xml:space="preserve">Normset per netbeheerder; versie 1 bevat de normset Liander (OP-01).</w:t>
+            </w:r>
+          </w:p>
+        </w:tc>
+        <w:tc>
+          <w:tcPr>
+            <w:tcW w:w="1315" w:type="dxa"/>
+          </w:tcPr>
+          <w:p>
+            <w:pPr/>
+            <w:r>
+              <w:t xml:space="preserve">Must</w:t>
+            </w:r>
+          </w:p>
+        </w:tc>
+      </w:tr>
+      <w:tr>
+        <w:tc>
+          <w:tcPr>
+            <w:tcW w:w="962" w:type="dxa"/>
+          </w:tcPr>
+          <w:p>
+            <w:pPr/>
+            <w:r>
+              <w:t xml:space="preserve">FR-28</w:t>
+            </w:r>
+          </w:p>
+        </w:tc>
+        <w:tc>
+          <w:tcPr>
+            <w:tcW w:w="1623" w:type="dxa"/>
+          </w:tcPr>
+          <w:p>
+            <w:pPr/>
+            <w:r>
+              <w:t xml:space="preserve">Dossier</w:t>
+            </w:r>
+          </w:p>
+        </w:tc>
+        <w:tc>
+          <w:tcPr>
+            <w:tcW w:w="5457" w:type="dxa"/>
+          </w:tcPr>
+          <w:p>
+            <w:pPr/>
+            <w:r>
+              <w:t xml:space="preserve">Het dossier bevat per tracédeel de volledige historie van alle registraties (actueel, vervangen, ingetrokken met reden) en de vrijgavehistorie.</w:t>
+            </w:r>
+          </w:p>
+        </w:tc>
+        <w:tc>
+          <w:tcPr>
+            <w:tcW w:w="1315" w:type="dxa"/>
+          </w:tcPr>
+          <w:p>
+            <w:pPr/>
+            <w:r>
+              <w:t xml:space="preserve">Must</w:t>
+            </w:r>
+          </w:p>
+        </w:tc>
+      </w:tr>
+      <w:tr>
+        <w:tc>
+          <w:tcPr>
+            <w:tcW w:w="962" w:type="dxa"/>
+          </w:tcPr>
+          <w:p>
+            <w:pPr/>
+            <w:r>
+              <w:t xml:space="preserve">FR-29</w:t>
+            </w:r>
+          </w:p>
+        </w:tc>
+        <w:tc>
+          <w:tcPr>
+            <w:tcW w:w="1623" w:type="dxa"/>
+          </w:tcPr>
+          <w:p>
+            <w:pPr/>
+            <w:r>
+              <w:t xml:space="preserve">Project</w:t>
+            </w:r>
+          </w:p>
+        </w:tc>
+        <w:tc>
+          <w:tcPr>
+            <w:tcW w:w="5457" w:type="dxa"/>
+          </w:tcPr>
+          <w:p>
+            <w:pPr/>
+            <w:r>
+              <w:t xml:space="preserve">Projecten en tracédelen met registraties kunnen niet worden verwijderd.</w:t>
+            </w:r>
+          </w:p>
+        </w:tc>
+        <w:tc>
+          <w:tcPr>
+            <w:tcW w:w="1315" w:type="dxa"/>
+          </w:tcPr>
+          <w:p>
+            <w:pPr/>
+            <w:r>
+              <w:t xml:space="preserve">Must</w:t>
+            </w:r>
+          </w:p>
+        </w:tc>
+      </w:tr>
+      <w:tr>
+        <w:tc>
+          <w:tcPr>
+            <w:tcW w:w="962" w:type="dxa"/>
+          </w:tcPr>
+          <w:p>
+            <w:pPr/>
+            <w:r>
+              <w:t xml:space="preserve">FR-30</w:t>
+            </w:r>
+          </w:p>
+        </w:tc>
+        <w:tc>
+          <w:tcPr>
+            <w:tcW w:w="1623" w:type="dxa"/>
+          </w:tcPr>
+          <w:p>
+            <w:pPr/>
+            <w:r>
+              <w:t xml:space="preserve">Opslag</w:t>
+            </w:r>
+          </w:p>
+        </w:tc>
+        <w:tc>
+          <w:tcPr>
+            <w:tcW w:w="5457" w:type="dxa"/>
+          </w:tcPr>
+          <w:p>
+            <w:pPr/>
+            <w:r>
+              <w:t xml:space="preserve">Gegevens, foto's en dossiers automatisch opslaan in de OneDrive/SharePoint-map van het Teams-kanaal van het project (OP-02).</w:t>
+            </w:r>
+          </w:p>
+        </w:tc>
+        <w:tc>
+          <w:tcPr>
+            <w:tcW w:w="1315" w:type="dxa"/>
+          </w:tcPr>
+          <w:p>
+            <w:pPr/>
+            <w:r>
+              <w:t xml:space="preserve">Must</w:t>
+            </w:r>
+          </w:p>
+        </w:tc>
+      </w:tr>
     </w:tbl>
     <w:p>
       <w:pPr>
@@ -2130,7 +2360,7 @@
     <w:p>
       <w:pPr/>
       <w:r>
-        <w:t xml:space="preserve">De app toetst elf eisen: vijf voor grondwerk en zes voor elektrotechnische montage. Acht ervan moeten vóór het aanvullen zijn aangetoond. De standaardwaarden zijn gangbare uitgangspunten uit de praktijk van Nederlandse netbeheerders en NEN-HD 620 / NEN 7171; het bestek en de specificatie van de netbeheerder zijn altijd leidend en worden per project ingesteld (FR-04).</w:t>
+        <w:t xml:space="preserve">De app toetst zeventien eisen: acht voor grondwerk en negen voor elektrotechnische montage. Elf ervan moeten vóór het aanvullen zijn aangetoond. De standaardwaarden vormen de normset Liander (OP-01); het zijn gangbare uitgangspunten uit de praktijk en NEN-HD 620 / NEN 7171 die nog met de Liander-specificatie geverifieerd moeten worden. Per project zijn ze aan te passen (FR-04).</w:t>
       </w:r>
     </w:p>
     <w:tbl>
@@ -2142,9 +2372,9 @@
       </w:tblPr>
       <w:tblGrid>
         <w:gridCol w:w="1560"/>
-        <w:gridCol w:w="2574"/>
-        <w:gridCol w:w="1746"/>
-        <w:gridCol w:w="1265"/>
+        <w:gridCol w:w="2454"/>
+        <w:gridCol w:w="1571"/>
+        <w:gridCol w:w="1560"/>
         <w:gridCol w:w="909"/>
         <w:gridCol w:w="1306"/>
       </w:tblGrid>
@@ -2166,7 +2396,7 @@
         </w:tc>
         <w:tc>
           <w:tcPr>
-            <w:tcW w:w="2574" w:type="dxa"/>
+            <w:tcW w:w="2454" w:type="dxa"/>
             <w:shd w:val="clear" w:color="auto" w:fill="F2F2F2"/>
           </w:tcPr>
           <w:p>
@@ -2178,7 +2408,7 @@
         </w:tc>
         <w:tc>
           <w:tcPr>
-            <w:tcW w:w="1746" w:type="dxa"/>
+            <w:tcW w:w="1571" w:type="dxa"/>
             <w:shd w:val="clear" w:color="auto" w:fill="F2F2F2"/>
           </w:tcPr>
           <w:p>
@@ -2190,7 +2420,7 @@
         </w:tc>
         <w:tc>
           <w:tcPr>
-            <w:tcW w:w="1265" w:type="dxa"/>
+            <w:tcW w:w="1560" w:type="dxa"/>
             <w:shd w:val="clear" w:color="auto" w:fill="F2F2F2"/>
           </w:tcPr>
           <w:p>
@@ -2239,7 +2469,7 @@
         </w:tc>
         <w:tc>
           <w:tcPr>
-            <w:tcW w:w="2574" w:type="dxa"/>
+            <w:tcW w:w="2454" w:type="dxa"/>
           </w:tcPr>
           <w:p>
             <w:pPr/>
@@ -2250,7 +2480,7 @@
         </w:tc>
         <w:tc>
           <w:tcPr>
-            <w:tcW w:w="1746" w:type="dxa"/>
+            <w:tcW w:w="1571" w:type="dxa"/>
           </w:tcPr>
           <w:p>
             <w:pPr/>
@@ -2261,7 +2491,7 @@
         </w:tc>
         <w:tc>
           <w:tcPr>
-            <w:tcW w:w="1265" w:type="dxa"/>
+            <w:tcW w:w="1560" w:type="dxa"/>
           </w:tcPr>
           <w:p>
             <w:pPr/>
@@ -2307,7 +2537,7 @@
         </w:tc>
         <w:tc>
           <w:tcPr>
-            <w:tcW w:w="2574" w:type="dxa"/>
+            <w:tcW w:w="2454" w:type="dxa"/>
           </w:tcPr>
           <w:p>
             <w:pPr/>
@@ -2318,7 +2548,7 @@
         </w:tc>
         <w:tc>
           <w:tcPr>
-            <w:tcW w:w="1746" w:type="dxa"/>
+            <w:tcW w:w="1571" w:type="dxa"/>
           </w:tcPr>
           <w:p>
             <w:pPr/>
@@ -2329,7 +2559,7 @@
         </w:tc>
         <w:tc>
           <w:tcPr>
-            <w:tcW w:w="1265" w:type="dxa"/>
+            <w:tcW w:w="1560" w:type="dxa"/>
           </w:tcPr>
           <w:p>
             <w:pPr/>
@@ -2375,7 +2605,7 @@
         </w:tc>
         <w:tc>
           <w:tcPr>
-            <w:tcW w:w="2574" w:type="dxa"/>
+            <w:tcW w:w="2454" w:type="dxa"/>
           </w:tcPr>
           <w:p>
             <w:pPr/>
@@ -2386,7 +2616,7 @@
         </w:tc>
         <w:tc>
           <w:tcPr>
-            <w:tcW w:w="1746" w:type="dxa"/>
+            <w:tcW w:w="1571" w:type="dxa"/>
           </w:tcPr>
           <w:p>
             <w:pPr/>
@@ -2397,7 +2627,7 @@
         </w:tc>
         <w:tc>
           <w:tcPr>
-            <w:tcW w:w="1265" w:type="dxa"/>
+            <w:tcW w:w="1560" w:type="dxa"/>
           </w:tcPr>
           <w:p>
             <w:pPr/>
@@ -2443,7 +2673,7 @@
         </w:tc>
         <w:tc>
           <w:tcPr>
-            <w:tcW w:w="2574" w:type="dxa"/>
+            <w:tcW w:w="2454" w:type="dxa"/>
           </w:tcPr>
           <w:p>
             <w:pPr/>
@@ -2454,7 +2684,7 @@
         </w:tc>
         <w:tc>
           <w:tcPr>
-            <w:tcW w:w="1746" w:type="dxa"/>
+            <w:tcW w:w="1571" w:type="dxa"/>
           </w:tcPr>
           <w:p>
             <w:pPr/>
@@ -2465,7 +2695,7 @@
         </w:tc>
         <w:tc>
           <w:tcPr>
-            <w:tcW w:w="1265" w:type="dxa"/>
+            <w:tcW w:w="1560" w:type="dxa"/>
           </w:tcPr>
           <w:p>
             <w:pPr/>
@@ -2511,7 +2741,7 @@
         </w:tc>
         <w:tc>
           <w:tcPr>
-            <w:tcW w:w="2574" w:type="dxa"/>
+            <w:tcW w:w="2454" w:type="dxa"/>
           </w:tcPr>
           <w:p>
             <w:pPr/>
@@ -2522,7 +2752,7 @@
         </w:tc>
         <w:tc>
           <w:tcPr>
-            <w:tcW w:w="1746" w:type="dxa"/>
+            <w:tcW w:w="1571" w:type="dxa"/>
           </w:tcPr>
           <w:p>
             <w:pPr/>
@@ -2533,7 +2763,7 @@
         </w:tc>
         <w:tc>
           <w:tcPr>
-            <w:tcW w:w="1265" w:type="dxa"/>
+            <w:tcW w:w="1560" w:type="dxa"/>
           </w:tcPr>
           <w:p>
             <w:pPr/>
@@ -2573,40 +2803,40 @@
           <w:p>
             <w:pPr/>
             <w:r>
-              <w:t xml:space="preserve">Buigstraal</w:t>
-            </w:r>
-          </w:p>
-        </w:tc>
-        <w:tc>
-          <w:tcPr>
-            <w:tcW w:w="2574" w:type="dxa"/>
-          </w:tcPr>
-          <w:p>
-            <w:pPr/>
-            <w:r>
-              <w:t xml:space="preserve">buitendiameter D in mm, gemeten buigstraal R in mm</w:t>
-            </w:r>
-          </w:p>
-        </w:tc>
-        <w:tc>
-          <w:tcPr>
-            <w:tcW w:w="1746" w:type="dxa"/>
-          </w:tcPr>
-          <w:p>
-            <w:pPr/>
-            <w:r>
-              <w:t xml:space="preserve">R ≥ factor × D</w:t>
-            </w:r>
-          </w:p>
-        </w:tc>
-        <w:tc>
-          <w:tcPr>
-            <w:tcW w:w="1265" w:type="dxa"/>
-          </w:tcPr>
-          <w:p>
-            <w:pPr/>
-            <w:r>
-              <w:t xml:space="preserve">15 × D</w:t>
+              <w:t xml:space="preserve">Mantelbuis (nieuw)</w:t>
+            </w:r>
+          </w:p>
+        </w:tc>
+        <w:tc>
+          <w:tcPr>
+            <w:tcW w:w="2454" w:type="dxa"/>
+          </w:tcPr>
+          <w:p>
+            <w:pPr/>
+            <w:r>
+              <w:t xml:space="preserve">binnendiameter buis en buitendiameter kabel in mm, lengte in m, doorgang ja/nee, einden afgedicht ja/nee</w:t>
+            </w:r>
+          </w:p>
+        </w:tc>
+        <w:tc>
+          <w:tcPr>
+            <w:tcW w:w="1571" w:type="dxa"/>
+          </w:tcPr>
+          <w:p>
+            <w:pPr/>
+            <w:r>
+              <w:t xml:space="preserve">binnendiameter ≥ factor × kabeldiameter, doorgang = ja, einden waterdicht = ja</w:t>
+            </w:r>
+          </w:p>
+        </w:tc>
+        <w:tc>
+          <w:tcPr>
+            <w:tcW w:w="1560" w:type="dxa"/>
+          </w:tcPr>
+          <w:p>
+            <w:pPr/>
+            <w:r>
+              <w:t xml:space="preserve">1,5 ×</w:t>
             </w:r>
           </w:p>
         </w:tc>
@@ -2617,6 +2847,74 @@
           <w:p>
             <w:pPr/>
             <w:r>
+              <w:t xml:space="preserve">2</w:t>
+            </w:r>
+          </w:p>
+        </w:tc>
+        <w:tc>
+          <w:tcPr>
+            <w:tcW w:w="1306" w:type="dxa"/>
+          </w:tcPr>
+          <w:p>
+            <w:pPr/>
+            <w:r>
+              <w:t xml:space="preserve">aanvullen</w:t>
+            </w:r>
+          </w:p>
+        </w:tc>
+      </w:tr>
+      <w:tr>
+        <w:tc>
+          <w:tcPr>
+            <w:tcW w:w="1560" w:type="dxa"/>
+          </w:tcPr>
+          <w:p>
+            <w:pPr/>
+            <w:r>
+              <w:t xml:space="preserve">Inmeting ligging x, y, z (nieuw)</w:t>
+            </w:r>
+          </w:p>
+        </w:tc>
+        <w:tc>
+          <w:tcPr>
+            <w:tcW w:w="2454" w:type="dxa"/>
+          </w:tcPr>
+          <w:p>
+            <w:pPr/>
+            <w:r>
+              <w:t xml:space="preserve">puntnummer, X en Y (RD), Z bovenkant kabel (NAP), meetmethode, nauwkeurigheid in cm</w:t>
+            </w:r>
+          </w:p>
+        </w:tc>
+        <w:tc>
+          <w:tcPr>
+            <w:tcW w:w="1571" w:type="dxa"/>
+          </w:tcPr>
+          <w:p>
+            <w:pPr/>
+            <w:r>
+              <w:t xml:space="preserve">alles ingevuld, nauwkeurigheid ≤ max</w:t>
+            </w:r>
+          </w:p>
+        </w:tc>
+        <w:tc>
+          <w:tcPr>
+            <w:tcW w:w="1560" w:type="dxa"/>
+          </w:tcPr>
+          <w:p>
+            <w:pPr/>
+            <w:r>
+              <w:t xml:space="preserve">5 cm</w:t>
+            </w:r>
+          </w:p>
+        </w:tc>
+        <w:tc>
+          <w:tcPr>
+            <w:tcW w:w="909" w:type="dxa"/>
+          </w:tcPr>
+          <w:p>
+            <w:pPr/>
+            <w:r>
               <w:t xml:space="preserve">1</w:t>
             </w:r>
           </w:p>
@@ -2641,13 +2939,149 @@
           <w:p>
             <w:pPr/>
             <w:r>
+              <w:t xml:space="preserve">Aanvulling en verdichting (nieuw)</w:t>
+            </w:r>
+          </w:p>
+        </w:tc>
+        <w:tc>
+          <w:tcPr>
+            <w:tcW w:w="2454" w:type="dxa"/>
+          </w:tcPr>
+          <w:p>
+            <w:pPr/>
+            <w:r>
+              <w:t xml:space="preserve">laagdikte in cm, verdichtingsmiddel, verdichtingsgraad in %, bovenlaag hersteld ja/nee</w:t>
+            </w:r>
+          </w:p>
+        </w:tc>
+        <w:tc>
+          <w:tcPr>
+            <w:tcW w:w="1571" w:type="dxa"/>
+          </w:tcPr>
+          <w:p>
+            <w:pPr/>
+            <w:r>
+              <w:t xml:space="preserve">laagdikte ≤ max, verdichtingsgraad ≥ min, hersteld = ja</w:t>
+            </w:r>
+          </w:p>
+        </w:tc>
+        <w:tc>
+          <w:tcPr>
+            <w:tcW w:w="1560" w:type="dxa"/>
+          </w:tcPr>
+          <w:p>
+            <w:pPr/>
+            <w:r>
+              <w:t xml:space="preserve">30 cm; 95 % Proctor</w:t>
+            </w:r>
+          </w:p>
+        </w:tc>
+        <w:tc>
+          <w:tcPr>
+            <w:tcW w:w="909" w:type="dxa"/>
+          </w:tcPr>
+          <w:p>
+            <w:pPr/>
+            <w:r>
+              <w:t xml:space="preserve">1</w:t>
+            </w:r>
+          </w:p>
+        </w:tc>
+        <w:tc>
+          <w:tcPr>
+            <w:tcW w:w="1306" w:type="dxa"/>
+          </w:tcPr>
+          <w:p>
+            <w:pPr/>
+            <w:r>
+              <w:t xml:space="preserve">oplevering</w:t>
+            </w:r>
+          </w:p>
+        </w:tc>
+      </w:tr>
+      <w:tr>
+        <w:tc>
+          <w:tcPr>
+            <w:tcW w:w="1560" w:type="dxa"/>
+          </w:tcPr>
+          <w:p>
+            <w:pPr/>
+            <w:r>
+              <w:t xml:space="preserve">Buigstraal (gewijzigd)</w:t>
+            </w:r>
+          </w:p>
+        </w:tc>
+        <w:tc>
+          <w:tcPr>
+            <w:tcW w:w="2454" w:type="dxa"/>
+          </w:tcPr>
+          <w:p>
+            <w:pPr/>
+            <w:r>
+              <w:t xml:space="preserve">kabeltype, min. buigstraal fabrikant (× D), buitendiameter D in mm, gemeten buigstraal R in mm</w:t>
+            </w:r>
+          </w:p>
+        </w:tc>
+        <w:tc>
+          <w:tcPr>
+            <w:tcW w:w="1571" w:type="dxa"/>
+          </w:tcPr>
+          <w:p>
+            <w:pPr/>
+            <w:r>
+              <w:t xml:space="preserve">R ≥ max(fabrikant, netbeheerder) × D</w:t>
+            </w:r>
+          </w:p>
+        </w:tc>
+        <w:tc>
+          <w:tcPr>
+            <w:tcW w:w="1560" w:type="dxa"/>
+          </w:tcPr>
+          <w:p>
+            <w:pPr/>
+            <w:r>
+              <w:t xml:space="preserve">fabrikantwaarde per registratie; Liander-eis volgt (OP-06)</w:t>
+            </w:r>
+          </w:p>
+        </w:tc>
+        <w:tc>
+          <w:tcPr>
+            <w:tcW w:w="909" w:type="dxa"/>
+          </w:tcPr>
+          <w:p>
+            <w:pPr/>
+            <w:r>
+              <w:t xml:space="preserve">1</w:t>
+            </w:r>
+          </w:p>
+        </w:tc>
+        <w:tc>
+          <w:tcPr>
+            <w:tcW w:w="1306" w:type="dxa"/>
+          </w:tcPr>
+          <w:p>
+            <w:pPr/>
+            <w:r>
+              <w:t xml:space="preserve">aanvullen</w:t>
+            </w:r>
+          </w:p>
+        </w:tc>
+      </w:tr>
+      <w:tr>
+        <w:tc>
+          <w:tcPr>
+            <w:tcW w:w="1560" w:type="dxa"/>
+          </w:tcPr>
+          <w:p>
+            <w:pPr/>
+            <w:r>
               <w:t xml:space="preserve">Trekkracht bij intrekken</w:t>
             </w:r>
           </w:p>
         </w:tc>
         <w:tc>
           <w:tcPr>
-            <w:tcW w:w="2574" w:type="dxa"/>
+            <w:tcW w:w="2454" w:type="dxa"/>
           </w:tcPr>
           <w:p>
             <w:pPr/>
@@ -2658,7 +3092,7 @@
         </w:tc>
         <w:tc>
           <w:tcPr>
-            <w:tcW w:w="1746" w:type="dxa"/>
+            <w:tcW w:w="1571" w:type="dxa"/>
           </w:tcPr>
           <w:p>
             <w:pPr/>
@@ -2669,7 +3103,7 @@
         </w:tc>
         <w:tc>
           <w:tcPr>
-            <w:tcW w:w="1265" w:type="dxa"/>
+            <w:tcW w:w="1560" w:type="dxa"/>
           </w:tcPr>
           <w:p>
             <w:pPr/>
@@ -2715,7 +3149,7 @@
         </w:tc>
         <w:tc>
           <w:tcPr>
-            <w:tcW w:w="2574" w:type="dxa"/>
+            <w:tcW w:w="2454" w:type="dxa"/>
           </w:tcPr>
           <w:p>
             <w:pPr/>
@@ -2726,7 +3160,7 @@
         </w:tc>
         <w:tc>
           <w:tcPr>
-            <w:tcW w:w="1746" w:type="dxa"/>
+            <w:tcW w:w="1571" w:type="dxa"/>
           </w:tcPr>
           <w:p>
             <w:pPr/>
@@ -2737,7 +3171,7 @@
         </w:tc>
         <w:tc>
           <w:tcPr>
-            <w:tcW w:w="1265" w:type="dxa"/>
+            <w:tcW w:w="1560" w:type="dxa"/>
           </w:tcPr>
           <w:p>
             <w:pPr/>
@@ -2777,13 +3211,81 @@
           <w:p>
             <w:pPr/>
             <w:r>
-              <w:t xml:space="preserve">Mof / eindsluiting</w:t>
-            </w:r>
-          </w:p>
-        </w:tc>
-        <w:tc>
-          <w:tcPr>
-            <w:tcW w:w="2574" w:type="dxa"/>
+              <w:t xml:space="preserve">Kabel- en haspelgegevens (nieuw)</w:t>
+            </w:r>
+          </w:p>
+        </w:tc>
+        <w:tc>
+          <w:tcPr>
+            <w:tcW w:w="2454" w:type="dxa"/>
+          </w:tcPr>
+          <w:p>
+            <w:pPr/>
+            <w:r>
+              <w:t xml:space="preserve">kabeltype, fabrikant, haspelnummer, productiejaar, gelegde lengte, meterstanden</w:t>
+            </w:r>
+          </w:p>
+        </w:tc>
+        <w:tc>
+          <w:tcPr>
+            <w:tcW w:w="1571" w:type="dxa"/>
+          </w:tcPr>
+          <w:p>
+            <w:pPr/>
+            <w:r>
+              <w:t xml:space="preserve">alles ingevuld</w:t>
+            </w:r>
+          </w:p>
+        </w:tc>
+        <w:tc>
+          <w:tcPr>
+            <w:tcW w:w="1560" w:type="dxa"/>
+          </w:tcPr>
+          <w:p>
+            <w:pPr/>
+            <w:r>
+              <w:t xml:space="preserve">–</w:t>
+            </w:r>
+          </w:p>
+        </w:tc>
+        <w:tc>
+          <w:tcPr>
+            <w:tcW w:w="909" w:type="dxa"/>
+          </w:tcPr>
+          <w:p>
+            <w:pPr/>
+            <w:r>
+              <w:t xml:space="preserve">1</w:t>
+            </w:r>
+          </w:p>
+        </w:tc>
+        <w:tc>
+          <w:tcPr>
+            <w:tcW w:w="1306" w:type="dxa"/>
+          </w:tcPr>
+          <w:p>
+            <w:pPr/>
+            <w:r>
+              <w:t xml:space="preserve">aanvullen</w:t>
+            </w:r>
+          </w:p>
+        </w:tc>
+      </w:tr>
+      <w:tr>
+        <w:tc>
+          <w:tcPr>
+            <w:tcW w:w="1560" w:type="dxa"/>
+          </w:tcPr>
+          <w:p>
+            <w:pPr/>
+            <w:r>
+              <w:t xml:space="preserve">Verbindingsmof</w:t>
+            </w:r>
+          </w:p>
+        </w:tc>
+        <w:tc>
+          <w:tcPr>
+            <w:tcW w:w="2454" w:type="dxa"/>
           </w:tcPr>
           <w:p>
             <w:pPr/>
@@ -2794,7 +3296,7 @@
         </w:tc>
         <w:tc>
           <w:tcPr>
-            <w:tcW w:w="1746" w:type="dxa"/>
+            <w:tcW w:w="1571" w:type="dxa"/>
           </w:tcPr>
           <w:p>
             <w:pPr/>
@@ -2805,7 +3307,7 @@
         </w:tc>
         <w:tc>
           <w:tcPr>
-            <w:tcW w:w="1265" w:type="dxa"/>
+            <w:tcW w:w="1560" w:type="dxa"/>
           </w:tcPr>
           <w:p>
             <w:pPr/>
@@ -2845,13 +3347,149 @@
           <w:p>
             <w:pPr/>
             <w:r>
+              <w:t xml:space="preserve">Eindsluiting (nieuw)</w:t>
+            </w:r>
+          </w:p>
+        </w:tc>
+        <w:tc>
+          <w:tcPr>
+            <w:tcW w:w="2454" w:type="dxa"/>
+          </w:tcPr>
+          <w:p>
+            <w:pPr/>
+            <w:r>
+              <w:t xml:space="preserve">positie, type en batch, monteur; 6 controlepunten ja/nee</w:t>
+            </w:r>
+          </w:p>
+        </w:tc>
+        <w:tc>
+          <w:tcPr>
+            <w:tcW w:w="1571" w:type="dxa"/>
+          </w:tcPr>
+          <w:p>
+            <w:pPr/>
+            <w:r>
+              <w:t xml:space="preserve">alle tekstvelden gevuld, alle controlepunten = ja</w:t>
+            </w:r>
+          </w:p>
+        </w:tc>
+        <w:tc>
+          <w:tcPr>
+            <w:tcW w:w="1560" w:type="dxa"/>
+          </w:tcPr>
+          <w:p>
+            <w:pPr/>
+            <w:r>
+              <w:t xml:space="preserve">–</w:t>
+            </w:r>
+          </w:p>
+        </w:tc>
+        <w:tc>
+          <w:tcPr>
+            <w:tcW w:w="909" w:type="dxa"/>
+          </w:tcPr>
+          <w:p>
+            <w:pPr/>
+            <w:r>
+              <w:t xml:space="preserve">2</w:t>
+            </w:r>
+          </w:p>
+        </w:tc>
+        <w:tc>
+          <w:tcPr>
+            <w:tcW w:w="1306" w:type="dxa"/>
+          </w:tcPr>
+          <w:p>
+            <w:pPr/>
+            <w:r>
+              <w:t xml:space="preserve">oplevering</w:t>
+            </w:r>
+          </w:p>
+        </w:tc>
+      </w:tr>
+      <w:tr>
+        <w:tc>
+          <w:tcPr>
+            <w:tcW w:w="1560" w:type="dxa"/>
+          </w:tcPr>
+          <w:p>
+            <w:pPr/>
+            <w:r>
+              <w:t xml:space="preserve">Aarding (nieuw)</w:t>
+            </w:r>
+          </w:p>
+        </w:tc>
+        <w:tc>
+          <w:tcPr>
+            <w:tcW w:w="2454" w:type="dxa"/>
+          </w:tcPr>
+          <w:p>
+            <w:pPr/>
+            <w:r>
+              <w:t xml:space="preserve">aardpunt, aardverspreidingsweerstand in Ω, meetmethode, schermen geaard ja/nee</w:t>
+            </w:r>
+          </w:p>
+        </w:tc>
+        <w:tc>
+          <w:tcPr>
+            <w:tcW w:w="1571" w:type="dxa"/>
+          </w:tcPr>
+          <w:p>
+            <w:pPr/>
+            <w:r>
+              <w:t xml:space="preserve">weerstand ≤ max, schermen geaard = ja</w:t>
+            </w:r>
+          </w:p>
+        </w:tc>
+        <w:tc>
+          <w:tcPr>
+            <w:tcW w:w="1560" w:type="dxa"/>
+          </w:tcPr>
+          <w:p>
+            <w:pPr/>
+            <w:r>
+              <w:t xml:space="preserve">3 Ω</w:t>
+            </w:r>
+          </w:p>
+        </w:tc>
+        <w:tc>
+          <w:tcPr>
+            <w:tcW w:w="909" w:type="dxa"/>
+          </w:tcPr>
+          <w:p>
+            <w:pPr/>
+            <w:r>
+              <w:t xml:space="preserve">1</w:t>
+            </w:r>
+          </w:p>
+        </w:tc>
+        <w:tc>
+          <w:tcPr>
+            <w:tcW w:w="1306" w:type="dxa"/>
+          </w:tcPr>
+          <w:p>
+            <w:pPr/>
+            <w:r>
+              <w:t xml:space="preserve">oplevering</w:t>
+            </w:r>
+          </w:p>
+        </w:tc>
+      </w:tr>
+      <w:tr>
+        <w:tc>
+          <w:tcPr>
+            <w:tcW w:w="1560" w:type="dxa"/>
+          </w:tcPr>
+          <w:p>
+            <w:pPr/>
+            <w:r>
               <w:t xml:space="preserve">Mantelbeproeving</w:t>
             </w:r>
           </w:p>
         </w:tc>
         <w:tc>
           <w:tcPr>
-            <w:tcW w:w="2574" w:type="dxa"/>
+            <w:tcW w:w="2454" w:type="dxa"/>
           </w:tcPr>
           <w:p>
             <w:pPr/>
@@ -2862,7 +3500,7 @@
         </w:tc>
         <w:tc>
           <w:tcPr>
-            <w:tcW w:w="1746" w:type="dxa"/>
+            <w:tcW w:w="1571" w:type="dxa"/>
           </w:tcPr>
           <w:p>
             <w:pPr/>
@@ -2873,7 +3511,7 @@
         </w:tc>
         <w:tc>
           <w:tcPr>
-            <w:tcW w:w="1265" w:type="dxa"/>
+            <w:tcW w:w="1560" w:type="dxa"/>
           </w:tcPr>
           <w:p>
             <w:pPr/>
@@ -2919,7 +3557,7 @@
         </w:tc>
         <w:tc>
           <w:tcPr>
-            <w:tcW w:w="2574" w:type="dxa"/>
+            <w:tcW w:w="2454" w:type="dxa"/>
           </w:tcPr>
           <w:p>
             <w:pPr/>
@@ -2930,7 +3568,7 @@
         </w:tc>
         <w:tc>
           <w:tcPr>
-            <w:tcW w:w="1746" w:type="dxa"/>
+            <w:tcW w:w="1571" w:type="dxa"/>
           </w:tcPr>
           <w:p>
             <w:pPr/>
@@ -2941,7 +3579,7 @@
         </w:tc>
         <w:tc>
           <w:tcPr>
-            <w:tcW w:w="1265" w:type="dxa"/>
+            <w:tcW w:w="1560" w:type="dxa"/>
           </w:tcPr>
           <w:p>
             <w:pPr/>
@@ -2977,7 +3615,19 @@
     <w:p>
       <w:pPr/>
       <w:r>
-        <w:t xml:space="preserve">De vijf controlepunten van een mof zijn: montagehandleiding gevolgd en afstripmaten gecontroleerd; verbinders geperst met de juiste matrijs; krimp volledig en zonder luchtinsluiting; aardscherm doorverbonden en afgedicht; mofput uitgevlakt en mof vrij van trek.</w:t>
+        <w:t xml:space="preserve">De vijf controlepunten van een verbindingsmof zijn: montagehandleiding gevolgd en afstripmaten gecontroleerd; verbinders geperst met de juiste matrijs; krimp volledig en zonder luchtinsluiting; aardscherm doorverbonden en afgedicht; mofput uitgevlakt en mof vrij van trek.</w:t>
+      </w:r>
+    </w:p>
+    <w:p>
+      <w:pPr/>
+      <w:r>
+        <w:t xml:space="preserve">De zes controlepunten van een eindsluiting zijn: montagehandleiding gevolgd en afstripmaten gecontroleerd; kabelschoenen geperst met de juiste matrijs; veldsturing en kruipweg correct aangebracht; aardscherm aangesloten op de aardrail; fasevolgorde en markering gecontroleerd; aansluitingen aangehaald met het voorgeschreven moment.</w:t>
+      </w:r>
+    </w:p>
+    <w:p>
+      <w:pPr/>
+      <w:r>
+        <w:t xml:space="preserve">De GPS van een telefoon (± 3–10 m) is niet nauwkeurig genoeg voor de inmeting; x, y en z komen van een GNSS-RTK-ontvanger of tachymeter.</w:t>
       </w:r>
     </w:p>
     <w:p>
@@ -3147,7 +3797,7 @@
           <w:p>
             <w:pPr/>
             <w:r>
-              <w:t xml:space="preserve">naam gebruiker, bedrijf</w:t>
+              <w:t xml:space="preserve">naam gebruiker, bedrijf, rol</w:t>
             </w:r>
           </w:p>
         </w:tc>
@@ -3182,7 +3832,7 @@
           <w:p>
             <w:pPr/>
             <w:r>
-              <w:t xml:space="preserve">naam, projectnummer, opdrachtgever, locatie, aanmaakdatum, afwijkende normwaarden per eis</w:t>
+              <w:t xml:space="preserve">naam, projectnummer, opdrachtgever, locatie, normset netbeheerder (Liander), aanmaakdatum, afwijkende normwaarden per eis</w:t>
             </w:r>
           </w:p>
         </w:tc>
@@ -3217,7 +3867,7 @@
           <w:p>
             <w:pPr/>
             <w:r>
-              <w:t xml:space="preserve">naam, van, tot, lijst vereiste eisen, aanmaakdatum, vrijgave (naam + tijdstip, optioneel)</w:t>
+              <w:t xml:space="preserve">naam, van, tot, lijst vereiste eisen, aanmaakdatum, huidige vrijgave (naam + rol + tijdstip), vrijgavehistorie (alle vrijgaven en intrekkingen met reden)</w:t>
             </w:r>
           </w:p>
         </w:tc>
@@ -3252,7 +3902,7 @@
           <w:p>
             <w:pPr/>
             <w:r>
-              <w:t xml:space="preserve">eis, ingevoerde waarden, gebruikte normwaarden, uitkomst + uitleg per deelcontrole, foto's, GPS-positie (breedte, lengte, nauwkeurigheid), naam, tijdstip, opmerking</w:t>
+              <w:t xml:space="preserve">eis, ingevoerde waarden, gebruikte normwaarden, uitkomst + uitleg per deelcontrole, foto's, GPS-positie (breedte, lengte, nauwkeurigheid), naam + rol, tijdstip, opmerking, intrekking (naam, tijdstip, reden; optioneel)</w:t>
             </w:r>
           </w:p>
         </w:tc>
@@ -3307,7 +3957,7 @@
     <w:p>
       <w:pPr/>
       <w:r>
-        <w:t xml:space="preserve">Verwijderen werkt door naar beneden: een project verwijderen verwijdert zijn tracédelen, registraties en foto's.</w:t>
+        <w:t xml:space="preserve">Registraties worden nooit verwijderd (OP-03). Een project of tracédeel kan alleen worden verwijderd zolang er geen registraties in staan.</w:t>
       </w:r>
     </w:p>
     <w:p>
@@ -3342,7 +3992,7 @@
         </w:numPr>
       </w:pPr>
       <w:r>
-        <w:t xml:space="preserve">Kop: titel "Bewijsdossier 20 kV kabelaanleg – &lt;projectnaam&gt;", projectnummer, opdrachtgever, locatie, datum en tijd van opstellen, naam en bedrijf van de opsteller.</w:t>
+        <w:t xml:space="preserve">Kop: titel "Bewijsdossier 20 kV kabelaanleg – &lt;projectnaam&gt;", projectnummer, opdrachtgever, locatie, normset, datum en tijd van opstellen, naam en bedrijf van de opsteller.</w:t>
       </w:r>
     </w:p>
     <w:p>
@@ -3390,7 +4040,7 @@
         </w:numPr>
       </w:pPr>
       <w:r>
-        <w:t xml:space="preserve">vrijgave: "Vrijgegeven voor aanvullen door &lt;naam&gt; op &lt;datum tijd&gt;" of "Nog niet vrijgegeven voor aanvullen";</w:t>
+        <w:t xml:space="preserve">vrijgave: "Vrijgegeven voor aanvullen door &lt;naam (rol)&gt; op &lt;datum tijd&gt;" of "Nog niet vrijgegeven voor aanvullen";</w:t>
       </w:r>
     </w:p>
     <w:p>
@@ -3402,7 +4052,7 @@
         </w:numPr>
       </w:pPr>
       <w:r>
-        <w:t xml:space="preserve">tabel met per eis: status, toetsing per deelcontrole met normwaarde, opmerking, naam, tijdstip en GPS-positie;</w:t>
+        <w:t xml:space="preserve">tabel met per eis de actuele registratie: status, toetsing per deelcontrole met normwaarde, opmerking, naam, tijdstip en GPS-positie;</w:t>
       </w:r>
     </w:p>
     <w:p>
@@ -3414,7 +4064,31 @@
         </w:numPr>
       </w:pPr>
       <w:r>
-        <w:t xml:space="preserve">de foto's bij die registraties.</w:t>
+        <w:t xml:space="preserve">de foto's bij die registraties;</w:t>
+      </w:r>
+    </w:p>
+    <w:p>
+      <w:pPr>
+        <w:pStyle w:val="ListParagraph"/>
+        <w:numPr>
+          <w:ilvl w:val="1"/>
+          <w:numId w:val="6"/>
+        </w:numPr>
+      </w:pPr>
+      <w:r>
+        <w:t xml:space="preserve">historie van alle registraties, ook vervangen en ingetrokken, met de reden van intrekking;</w:t>
+      </w:r>
+    </w:p>
+    <w:p>
+      <w:pPr>
+        <w:pStyle w:val="ListParagraph"/>
+        <w:numPr>
+          <w:ilvl w:val="1"/>
+          <w:numId w:val="6"/>
+        </w:numPr>
+      </w:pPr>
+      <w:r>
+        <w:t xml:space="preserve">vrijgavehistorie: elke vrijgave en intrekking met naam, tijdstip en reden.</w:t>
       </w:r>
     </w:p>
     <w:p>
@@ -3784,7 +4458,7 @@
           <w:p>
             <w:pPr/>
             <w:r>
-              <w:t xml:space="preserve">Camera en locatie alleen na toestemming en alleen tijdens gebruik; geen gegevens naar externe servers.</w:t>
+              <w:t xml:space="preserve">Camera en locatie alleen na toestemming en alleen tijdens gebruik; gegevens gaan alleen naar de eigen OneDrive/SharePoint van de organisatie (FR-30).</w:t>
             </w:r>
           </w:p>
         </w:tc>
@@ -3900,7 +4574,7 @@
         <w:pStyle w:val="Heading2"/>
       </w:pPr>
       <w:r>
-        <w:t xml:space="preserve">10. Buiten scope en open punten</w:t>
+        <w:t xml:space="preserve">10. Buiten scope, besluiten en open punten</w:t>
       </w:r>
     </w:p>
     <w:p>
@@ -3945,7 +4619,7 @@
         </w:numPr>
       </w:pPr>
       <w:r>
-        <w:t xml:space="preserve">Inloggen, rollen en het delen van één project tussen meerdere toestellen.</w:t>
+        <w:t xml:space="preserve">Inloggen met een account en het afdwingen van rollen; gelijktijdig werken aan één project op meerdere toestellen.</w:t>
       </w:r>
     </w:p>
     <w:p>
@@ -3966,7 +4640,7 @@
         <w:rPr>
           <w:b/>
         </w:rPr>
-        <w:t xml:space="preserve">Open punten</w:t>
+        <w:t xml:space="preserve">Besluiten en open punten</w:t>
       </w:r>
     </w:p>
     <w:tbl>
@@ -3978,8 +4652,9 @@
       </w:tblPr>
       <w:tblGrid>
         <w:gridCol w:w="868"/>
-        <w:gridCol w:w="3572"/>
-        <w:gridCol w:w="4920"/>
+        <w:gridCol w:w="2205"/>
+        <w:gridCol w:w="2340"/>
+        <w:gridCol w:w="3947"/>
       </w:tblGrid>
       <w:tr>
         <w:trPr>
@@ -3999,7 +4674,7 @@
         </w:tc>
         <w:tc>
           <w:tcPr>
-            <w:tcW w:w="3572" w:type="dxa"/>
+            <w:tcW w:w="2205" w:type="dxa"/>
             <w:shd w:val="clear" w:color="auto" w:fill="F2F2F2"/>
           </w:tcPr>
           <w:p>
@@ -4011,13 +4686,25 @@
         </w:tc>
         <w:tc>
           <w:tcPr>
-            <w:tcW w:w="4920" w:type="dxa"/>
+            <w:tcW w:w="2340" w:type="dxa"/>
             <w:shd w:val="clear" w:color="auto" w:fill="F2F2F2"/>
           </w:tcPr>
           <w:p>
             <w:pPr/>
             <w:r>
-              <w:t xml:space="preserve">Voorstel</w:t>
+              <w:t xml:space="preserve">Besluit</w:t>
+            </w:r>
+          </w:p>
+        </w:tc>
+        <w:tc>
+          <w:tcPr>
+            <w:tcW w:w="3947" w:type="dxa"/>
+            <w:shd w:val="clear" w:color="auto" w:fill="F2F2F2"/>
+          </w:tcPr>
+          <w:p>
+            <w:pPr/>
+            <w:r>
+              <w:t xml:space="preserve">Uitwerking</w:t>
             </w:r>
           </w:p>
         </w:tc>
@@ -4036,7 +4723,7 @@
         </w:tc>
         <w:tc>
           <w:tcPr>
-            <w:tcW w:w="3572" w:type="dxa"/>
+            <w:tcW w:w="2205" w:type="dxa"/>
           </w:tcPr>
           <w:p>
             <w:pPr/>
@@ -4047,12 +4734,23 @@
         </w:tc>
         <w:tc>
           <w:tcPr>
-            <w:tcW w:w="4920" w:type="dxa"/>
-          </w:tcPr>
-          <w:p>
-            <w:pPr/>
-            <w:r>
-              <w:t xml:space="preserve">Per netbeheerder een sjabloon met normwaarden, te kiezen bij het aanmaken van een project.</w:t>
+            <w:tcW w:w="2340" w:type="dxa"/>
+          </w:tcPr>
+          <w:p>
+            <w:pPr/>
+            <w:r>
+              <w:t xml:space="preserve">Liander</w:t>
+            </w:r>
+          </w:p>
+        </w:tc>
+        <w:tc>
+          <w:tcPr>
+            <w:tcW w:w="3947" w:type="dxa"/>
+          </w:tcPr>
+          <w:p>
+            <w:pPr/>
+            <w:r>
+              <w:t xml:space="preserve">Normset Liander per project (FR-27). De waarden zijn een uitgangspunt; zie OP-08.</w:t>
             </w:r>
           </w:p>
         </w:tc>
@@ -4071,7 +4769,7 @@
         </w:tc>
         <w:tc>
           <w:tcPr>
-            <w:tcW w:w="3572" w:type="dxa"/>
+            <w:tcW w:w="2205" w:type="dxa"/>
           </w:tcPr>
           <w:p>
             <w:pPr/>
@@ -4082,12 +4780,23 @@
         </w:tc>
         <w:tc>
           <w:tcPr>
-            <w:tcW w:w="4920" w:type="dxa"/>
-          </w:tcPr>
-          <w:p>
-            <w:pPr/>
-            <w:r>
-              <w:t xml:space="preserve">Versie 2: synchronisatie naar een gedeelde opslag; tot die tijd na elk tracédeel het dossier exporteren.</w:t>
+            <w:tcW w:w="2340" w:type="dxa"/>
+          </w:tcPr>
+          <w:p>
+            <w:pPr/>
+            <w:r>
+              <w:t xml:space="preserve">Opslaan in OneDrive, gekoppeld aan de map van het Teams-kanaal</w:t>
+            </w:r>
+          </w:p>
+        </w:tc>
+        <w:tc>
+          <w:tcPr>
+            <w:tcW w:w="3947" w:type="dxa"/>
+          </w:tcPr>
+          <w:p>
+            <w:pPr/>
+            <w:r>
+              <w:t xml:space="preserve">FR-30. Nog niet gebouwd: vraagt een app-registratie in Microsoft Entra ID (zie OP-10). Tot die tijd het dossier via het deelmenu naar OneDrive/Teams opslaan.</w:t>
             </w:r>
           </w:p>
         </w:tc>
@@ -4106,7 +4815,7 @@
         </w:tc>
         <w:tc>
           <w:tcPr>
-            <w:tcW w:w="3572" w:type="dxa"/>
+            <w:tcW w:w="2205" w:type="dxa"/>
           </w:tcPr>
           <w:p>
             <w:pPr/>
@@ -4117,12 +4826,23 @@
         </w:tc>
         <w:tc>
           <w:tcPr>
-            <w:tcW w:w="4920" w:type="dxa"/>
-          </w:tcPr>
-          <w:p>
-            <w:pPr/>
-            <w:r>
-              <w:t xml:space="preserve">Niet verwijderen maar intrekken met reden; ingetrokken registraties blijven in het dossier zichtbaar.</w:t>
+            <w:tcW w:w="2340" w:type="dxa"/>
+          </w:tcPr>
+          <w:p>
+            <w:pPr/>
+            <w:r>
+              <w:t xml:space="preserve">Alle registraties behouden, status aangeven</w:t>
+            </w:r>
+          </w:p>
+        </w:tc>
+        <w:tc>
+          <w:tcPr>
+            <w:tcW w:w="3947" w:type="dxa"/>
+          </w:tcPr>
+          <w:p>
+            <w:pPr/>
+            <w:r>
+              <w:t xml:space="preserve">Gebouwd: intrekken met reden (FR-18), statussen Actueel, Vervangen en Ingetrokken, volledige historie in het dossier (FR-28).</w:t>
             </w:r>
           </w:p>
         </w:tc>
@@ -4141,7 +4861,7 @@
         </w:tc>
         <w:tc>
           <w:tcPr>
-            <w:tcW w:w="3572" w:type="dxa"/>
+            <w:tcW w:w="2205" w:type="dxa"/>
           </w:tcPr>
           <w:p>
             <w:pPr/>
@@ -4152,12 +4872,23 @@
         </w:tc>
         <w:tc>
           <w:tcPr>
-            <w:tcW w:w="4920" w:type="dxa"/>
-          </w:tcPr>
-          <w:p>
-            <w:pPr/>
-            <w:r>
-              <w:t xml:space="preserve">Alleen de toezichthouder of werkverantwoordelijke; vraagt om rollen (versie 2).</w:t>
+            <w:tcW w:w="2340" w:type="dxa"/>
+          </w:tcPr>
+          <w:p>
+            <w:pPr/>
+            <w:r>
+              <w:t xml:space="preserve">De werkverantwoordelijke</w:t>
+            </w:r>
+          </w:p>
+        </w:tc>
+        <w:tc>
+          <w:tcPr>
+            <w:tcW w:w="3947" w:type="dxa"/>
+          </w:tcPr>
+          <w:p>
+            <w:pPr/>
+            <w:r>
+              <w:t xml:space="preserve">Gebouwd: rol bij Instellingen; vrijgeven en intrekken alleen met rol Werkverantwoordelijke (FR-20, FR-22). Zie OP-09.</w:t>
             </w:r>
           </w:p>
         </w:tc>
@@ -4176,7 +4907,7 @@
         </w:tc>
         <w:tc>
           <w:tcPr>
-            <w:tcW w:w="3572" w:type="dxa"/>
+            <w:tcW w:w="2205" w:type="dxa"/>
           </w:tcPr>
           <w:p>
             <w:pPr/>
@@ -4187,12 +4918,23 @@
         </w:tc>
         <w:tc>
           <w:tcPr>
-            <w:tcW w:w="4920" w:type="dxa"/>
-          </w:tcPr>
-          <w:p>
-            <w:pPr/>
-            <w:r>
-              <w:t xml:space="preserve">Kandidaten: verdichting van de aanvulling, kabeleindafsluiting als aparte eis, mantelbuizen, aarding en inmeting van de ligging (x, y, z).</w:t>
+            <w:tcW w:w="2340" w:type="dxa"/>
+          </w:tcPr>
+          <w:p>
+            <w:pPr/>
+            <w:r>
+              <w:t xml:space="preserve">Alle kandidaten toevoegen; liever nu meer informatie dan later te weinig</w:t>
+            </w:r>
+          </w:p>
+        </w:tc>
+        <w:tc>
+          <w:tcPr>
+            <w:tcW w:w="3947" w:type="dxa"/>
+          </w:tcPr>
+          <w:p>
+            <w:pPr/>
+            <w:r>
+              <w:t xml:space="preserve">Gebouwd: mantelbuis, inmeting x/y/z, aanvulling en verdichting, eindsluiting, aarding, plus kabel- en haspelgegevens (hoofdstuk 6).</w:t>
             </w:r>
           </w:p>
         </w:tc>
@@ -4211,7 +4953,7 @@
         </w:tc>
         <w:tc>
           <w:tcPr>
-            <w:tcW w:w="3572" w:type="dxa"/>
+            <w:tcW w:w="2205" w:type="dxa"/>
           </w:tcPr>
           <w:p>
             <w:pPr/>
@@ -4222,12 +4964,23 @@
         </w:tc>
         <w:tc>
           <w:tcPr>
-            <w:tcW w:w="4920" w:type="dxa"/>
-          </w:tcPr>
-          <w:p>
-            <w:pPr/>
-            <w:r>
-              <w:t xml:space="preserve">Per kabeltype de waarde van de fabrikant aanhouden (vaak 15–20 × D tijdens leggen).</w:t>
+            <w:tcW w:w="2340" w:type="dxa"/>
+          </w:tcPr>
+          <w:p>
+            <w:pPr/>
+            <w:r>
+              <w:t xml:space="preserve">Waarde van de fabrikant; later de eisen van Liander</w:t>
+            </w:r>
+          </w:p>
+        </w:tc>
+        <w:tc>
+          <w:tcPr>
+            <w:tcW w:w="3947" w:type="dxa"/>
+          </w:tcPr>
+          <w:p>
+            <w:pPr/>
+            <w:r>
+              <w:t xml:space="preserve">Gebouwd: fabrikantwaarde per registratie; projectwaarde voor de Liander-eis (0 = nog geen eis). De strengste telt.</w:t>
             </w:r>
           </w:p>
         </w:tc>
@@ -4246,7 +4999,7 @@
         </w:tc>
         <w:tc>
           <w:tcPr>
-            <w:tcW w:w="3572" w:type="dxa"/>
+            <w:tcW w:w="2205" w:type="dxa"/>
           </w:tcPr>
           <w:p>
             <w:pPr/>
@@ -4257,12 +5010,161 @@
         </w:tc>
         <w:tc>
           <w:tcPr>
-            <w:tcW w:w="4920" w:type="dxa"/>
-          </w:tcPr>
-          <w:p>
-            <w:pPr/>
-            <w:r>
-              <w:t xml:space="preserve">Stempel in de foto zelf, zodat losse foto's ook herleidbaar zijn.</w:t>
+            <w:tcW w:w="2340" w:type="dxa"/>
+          </w:tcPr>
+          <w:p>
+            <w:pPr/>
+            <w:r>
+              <w:t xml:space="preserve">Open</w:t>
+            </w:r>
+          </w:p>
+        </w:tc>
+        <w:tc>
+          <w:tcPr>
+            <w:tcW w:w="3947" w:type="dxa"/>
+          </w:tcPr>
+          <w:p>
+            <w:pPr/>
+            <w:r>
+              <w:t xml:space="preserve">Voorstel: stempel in de foto zelf, zodat losse foto's ook herleidbaar zijn.</w:t>
+            </w:r>
+          </w:p>
+        </w:tc>
+      </w:tr>
+      <w:tr>
+        <w:tc>
+          <w:tcPr>
+            <w:tcW w:w="868" w:type="dxa"/>
+          </w:tcPr>
+          <w:p>
+            <w:pPr/>
+            <w:r>
+              <w:t xml:space="preserve">OP-08</w:t>
+            </w:r>
+          </w:p>
+        </w:tc>
+        <w:tc>
+          <w:tcPr>
+            <w:tcW w:w="2205" w:type="dxa"/>
+          </w:tcPr>
+          <w:p>
+            <w:pPr/>
+            <w:r>
+              <w:t xml:space="preserve">Wie levert de Liander-specificatie om de normwaarden te verifiëren?</w:t>
+            </w:r>
+          </w:p>
+        </w:tc>
+        <w:tc>
+          <w:tcPr>
+            <w:tcW w:w="2340" w:type="dxa"/>
+          </w:tcPr>
+          <w:p>
+            <w:pPr/>
+            <w:r>
+              <w:t xml:space="preserve">Open</w:t>
+            </w:r>
+          </w:p>
+        </w:tc>
+        <w:tc>
+          <w:tcPr>
+            <w:tcW w:w="3947" w:type="dxa"/>
+          </w:tcPr>
+          <w:p>
+            <w:pPr/>
+            <w:r>
+              <w:t xml:space="preserve">De specificatie is niet openbaar. Na ontvangst de normset Liander bijwerken en markeren als geverifieerd.</w:t>
+            </w:r>
+          </w:p>
+        </w:tc>
+      </w:tr>
+      <w:tr>
+        <w:tc>
+          <w:tcPr>
+            <w:tcW w:w="868" w:type="dxa"/>
+          </w:tcPr>
+          <w:p>
+            <w:pPr/>
+            <w:r>
+              <w:t xml:space="preserve">OP-09</w:t>
+            </w:r>
+          </w:p>
+        </w:tc>
+        <w:tc>
+          <w:tcPr>
+            <w:tcW w:w="2205" w:type="dxa"/>
+          </w:tcPr>
+          <w:p>
+            <w:pPr/>
+            <w:r>
+              <w:t xml:space="preserve">De rol wordt zonder inlog gekozen en dus niet afgedwongen. Is dat voldoende?</w:t>
+            </w:r>
+          </w:p>
+        </w:tc>
+        <w:tc>
+          <w:tcPr>
+            <w:tcW w:w="2340" w:type="dxa"/>
+          </w:tcPr>
+          <w:p>
+            <w:pPr/>
+            <w:r>
+              <w:t xml:space="preserve">Open</w:t>
+            </w:r>
+          </w:p>
+        </w:tc>
+        <w:tc>
+          <w:tcPr>
+            <w:tcW w:w="3947" w:type="dxa"/>
+          </w:tcPr>
+          <w:p>
+            <w:pPr/>
+            <w:r>
+              <w:t xml:space="preserve">Voorstel: inloggen met het Microsoft-account; dat is ook nodig voor OneDrive (OP-02) en levert naam en rol uit de organisatie.</w:t>
+            </w:r>
+          </w:p>
+        </w:tc>
+      </w:tr>
+      <w:tr>
+        <w:tc>
+          <w:tcPr>
+            <w:tcW w:w="868" w:type="dxa"/>
+          </w:tcPr>
+          <w:p>
+            <w:pPr/>
+            <w:r>
+              <w:t xml:space="preserve">OP-10</w:t>
+            </w:r>
+          </w:p>
+        </w:tc>
+        <w:tc>
+          <w:tcPr>
+            <w:tcW w:w="2205" w:type="dxa"/>
+          </w:tcPr>
+          <w:p>
+            <w:pPr/>
+            <w:r>
+              <w:t xml:space="preserve">Welke tenant, Teams-team en map gebruiken we voor de opslag?</w:t>
+            </w:r>
+          </w:p>
+        </w:tc>
+        <w:tc>
+          <w:tcPr>
+            <w:tcW w:w="2340" w:type="dxa"/>
+          </w:tcPr>
+          <w:p>
+            <w:pPr/>
+            <w:r>
+              <w:t xml:space="preserve">Open</w:t>
+            </w:r>
+          </w:p>
+        </w:tc>
+        <w:tc>
+          <w:tcPr>
+            <w:tcW w:w="3947" w:type="dxa"/>
+          </w:tcPr>
+          <w:p>
+            <w:pPr/>
+            <w:r>
+              <w:t xml:space="preserve">Nodig: app-registratie (client-ID) door de IT-beheerder, met rechten op Files.ReadWrite en Sites.ReadWrite, en per project de Teams-map.</w:t>
             </w:r>
           </w:p>
         </w:tc>

</xml_diff>